<commit_message>
POP Word file: add 2mm gap between cards so cut lines don't touch
Co-Authored-By: Claude Opus 5.5 <noreply@anthropic.com>
Claude-Session: https://claude.ai/code/session_011hUg9YhSLBC5JcTuvfYEDh
</commit_message>
<xml_diff>
--- a/pop/pop_cards_A4.docx
+++ b/pop/pop_cards_A4.docx
@@ -4,7 +4,7 @@
   <w:body>
     <w:tbl>
       <w:tblPr>
-        <w:tblW w:type="dxa" w:w="10204"/>
+        <w:tblW w:type="dxa" w:w="10317"/>
         <w:tblBorders>
           <w:top w:val="single" w:color="auto" w:sz="4"/>
           <w:left w:val="single" w:color="auto" w:sz="4"/>
@@ -17,6 +17,7 @@
       </w:tblPr>
       <w:tblGrid>
         <w:gridCol w:w="5102"/>
+        <w:gridCol w:w="113"/>
         <w:gridCol w:w="5102"/>
       </w:tblGrid>
       <w:tr>
@@ -112,6 +113,35 @@
         </w:tc>
         <w:tc>
           <w:tcPr>
+            <w:tcW w:type="dxa" w:w="113"/>
+            <w:tcBorders>
+              <w:top w:val="none" w:color="FFFFFF" w:sz="0"/>
+              <w:left w:val="none" w:color="FFFFFF" w:sz="0"/>
+              <w:bottom w:val="none" w:color="FFFFFF" w:sz="0"/>
+              <w:right w:val="none" w:color="FFFFFF" w:sz="0"/>
+            </w:tcBorders>
+            <w:tcMar>
+              <w:top w:type="dxa" w:w="0"/>
+              <w:left w:type="dxa" w:w="0"/>
+              <w:bottom w:type="dxa" w:w="0"/>
+              <w:right w:type="dxa" w:w="0"/>
+            </w:tcMar>
+          </w:tcPr>
+          <w:p>
+            <w:pPr>
+              <w:spacing w:after="0" w:before="0" w:line="20" w:lineRule="exact"/>
+            </w:pPr>
+            <w:r>
+              <w:rPr>
+                <w:sz w:val="2"/>
+                <w:szCs w:val="2"/>
+              </w:rPr>
+              <w:t xml:space="preserve"/>
+            </w:r>
+          </w:p>
+        </w:tc>
+        <w:tc>
+          <w:tcPr>
             <w:tcW w:type="dxa" w:w="5102"/>
             <w:tcBorders>
               <w:top w:val="single" w:color="9E9E9E" w:sz="4"/>
@@ -193,6 +223,98 @@
                 <w:szCs w:val="32"/>
               </w:rPr>
               <w:t xml:space="preserve">- Patch &amp; Holder -</w:t>
+            </w:r>
+          </w:p>
+        </w:tc>
+      </w:tr>
+      <w:tr>
+        <w:trPr>
+          <w:trHeight w:val="113" w:hRule="exact"/>
+        </w:trPr>
+        <w:tc>
+          <w:tcPr>
+            <w:tcW w:type="dxa" w:w="5102"/>
+            <w:tcBorders>
+              <w:top w:val="none" w:color="FFFFFF" w:sz="0"/>
+              <w:left w:val="none" w:color="FFFFFF" w:sz="0"/>
+              <w:bottom w:val="none" w:color="FFFFFF" w:sz="0"/>
+              <w:right w:val="none" w:color="FFFFFF" w:sz="0"/>
+            </w:tcBorders>
+            <w:tcMar>
+              <w:top w:type="dxa" w:w="0"/>
+              <w:left w:type="dxa" w:w="0"/>
+              <w:bottom w:type="dxa" w:w="0"/>
+              <w:right w:type="dxa" w:w="0"/>
+            </w:tcMar>
+          </w:tcPr>
+          <w:p>
+            <w:pPr>
+              <w:spacing w:after="0" w:before="0" w:line="20" w:lineRule="exact"/>
+            </w:pPr>
+            <w:r>
+              <w:rPr>
+                <w:sz w:val="2"/>
+                <w:szCs w:val="2"/>
+              </w:rPr>
+              <w:t xml:space="preserve"/>
+            </w:r>
+          </w:p>
+        </w:tc>
+        <w:tc>
+          <w:tcPr>
+            <w:tcW w:type="dxa" w:w="113"/>
+            <w:tcBorders>
+              <w:top w:val="none" w:color="FFFFFF" w:sz="0"/>
+              <w:left w:val="none" w:color="FFFFFF" w:sz="0"/>
+              <w:bottom w:val="none" w:color="FFFFFF" w:sz="0"/>
+              <w:right w:val="none" w:color="FFFFFF" w:sz="0"/>
+            </w:tcBorders>
+            <w:tcMar>
+              <w:top w:type="dxa" w:w="0"/>
+              <w:left w:type="dxa" w:w="0"/>
+              <w:bottom w:type="dxa" w:w="0"/>
+              <w:right w:type="dxa" w:w="0"/>
+            </w:tcMar>
+          </w:tcPr>
+          <w:p>
+            <w:pPr>
+              <w:spacing w:after="0" w:before="0" w:line="20" w:lineRule="exact"/>
+            </w:pPr>
+            <w:r>
+              <w:rPr>
+                <w:sz w:val="2"/>
+                <w:szCs w:val="2"/>
+              </w:rPr>
+              <w:t xml:space="preserve"/>
+            </w:r>
+          </w:p>
+        </w:tc>
+        <w:tc>
+          <w:tcPr>
+            <w:tcW w:type="dxa" w:w="5102"/>
+            <w:tcBorders>
+              <w:top w:val="none" w:color="FFFFFF" w:sz="0"/>
+              <w:left w:val="none" w:color="FFFFFF" w:sz="0"/>
+              <w:bottom w:val="none" w:color="FFFFFF" w:sz="0"/>
+              <w:right w:val="none" w:color="FFFFFF" w:sz="0"/>
+            </w:tcBorders>
+            <w:tcMar>
+              <w:top w:type="dxa" w:w="0"/>
+              <w:left w:type="dxa" w:w="0"/>
+              <w:bottom w:type="dxa" w:w="0"/>
+              <w:right w:type="dxa" w:w="0"/>
+            </w:tcMar>
+          </w:tcPr>
+          <w:p>
+            <w:pPr>
+              <w:spacing w:after="0" w:before="0" w:line="20" w:lineRule="exact"/>
+            </w:pPr>
+            <w:r>
+              <w:rPr>
+                <w:sz w:val="2"/>
+                <w:szCs w:val="2"/>
+              </w:rPr>
+              <w:t xml:space="preserve"/>
             </w:r>
           </w:p>
         </w:tc>
@@ -290,6 +412,35 @@
         </w:tc>
         <w:tc>
           <w:tcPr>
+            <w:tcW w:type="dxa" w:w="113"/>
+            <w:tcBorders>
+              <w:top w:val="none" w:color="FFFFFF" w:sz="0"/>
+              <w:left w:val="none" w:color="FFFFFF" w:sz="0"/>
+              <w:bottom w:val="none" w:color="FFFFFF" w:sz="0"/>
+              <w:right w:val="none" w:color="FFFFFF" w:sz="0"/>
+            </w:tcBorders>
+            <w:tcMar>
+              <w:top w:type="dxa" w:w="0"/>
+              <w:left w:type="dxa" w:w="0"/>
+              <w:bottom w:type="dxa" w:w="0"/>
+              <w:right w:type="dxa" w:w="0"/>
+            </w:tcMar>
+          </w:tcPr>
+          <w:p>
+            <w:pPr>
+              <w:spacing w:after="0" w:before="0" w:line="20" w:lineRule="exact"/>
+            </w:pPr>
+            <w:r>
+              <w:rPr>
+                <w:sz w:val="2"/>
+                <w:szCs w:val="2"/>
+              </w:rPr>
+              <w:t xml:space="preserve"/>
+            </w:r>
+          </w:p>
+        </w:tc>
+        <w:tc>
+          <w:tcPr>
             <w:tcW w:type="dxa" w:w="5102"/>
             <w:tcBorders>
               <w:top w:val="single" w:color="9E9E9E" w:sz="4"/>
@@ -371,6 +522,98 @@
                 <w:szCs w:val="32"/>
               </w:rPr>
               <w:t xml:space="preserve">- ECG/APW Sensor IC -</w:t>
+            </w:r>
+          </w:p>
+        </w:tc>
+      </w:tr>
+      <w:tr>
+        <w:trPr>
+          <w:trHeight w:val="113" w:hRule="exact"/>
+        </w:trPr>
+        <w:tc>
+          <w:tcPr>
+            <w:tcW w:type="dxa" w:w="5102"/>
+            <w:tcBorders>
+              <w:top w:val="none" w:color="FFFFFF" w:sz="0"/>
+              <w:left w:val="none" w:color="FFFFFF" w:sz="0"/>
+              <w:bottom w:val="none" w:color="FFFFFF" w:sz="0"/>
+              <w:right w:val="none" w:color="FFFFFF" w:sz="0"/>
+            </w:tcBorders>
+            <w:tcMar>
+              <w:top w:type="dxa" w:w="0"/>
+              <w:left w:type="dxa" w:w="0"/>
+              <w:bottom w:type="dxa" w:w="0"/>
+              <w:right w:type="dxa" w:w="0"/>
+            </w:tcMar>
+          </w:tcPr>
+          <w:p>
+            <w:pPr>
+              <w:spacing w:after="0" w:before="0" w:line="20" w:lineRule="exact"/>
+            </w:pPr>
+            <w:r>
+              <w:rPr>
+                <w:sz w:val="2"/>
+                <w:szCs w:val="2"/>
+              </w:rPr>
+              <w:t xml:space="preserve"/>
+            </w:r>
+          </w:p>
+        </w:tc>
+        <w:tc>
+          <w:tcPr>
+            <w:tcW w:type="dxa" w:w="113"/>
+            <w:tcBorders>
+              <w:top w:val="none" w:color="FFFFFF" w:sz="0"/>
+              <w:left w:val="none" w:color="FFFFFF" w:sz="0"/>
+              <w:bottom w:val="none" w:color="FFFFFF" w:sz="0"/>
+              <w:right w:val="none" w:color="FFFFFF" w:sz="0"/>
+            </w:tcBorders>
+            <w:tcMar>
+              <w:top w:type="dxa" w:w="0"/>
+              <w:left w:type="dxa" w:w="0"/>
+              <w:bottom w:type="dxa" w:w="0"/>
+              <w:right w:type="dxa" w:w="0"/>
+            </w:tcMar>
+          </w:tcPr>
+          <w:p>
+            <w:pPr>
+              <w:spacing w:after="0" w:before="0" w:line="20" w:lineRule="exact"/>
+            </w:pPr>
+            <w:r>
+              <w:rPr>
+                <w:sz w:val="2"/>
+                <w:szCs w:val="2"/>
+              </w:rPr>
+              <w:t xml:space="preserve"/>
+            </w:r>
+          </w:p>
+        </w:tc>
+        <w:tc>
+          <w:tcPr>
+            <w:tcW w:type="dxa" w:w="5102"/>
+            <w:tcBorders>
+              <w:top w:val="none" w:color="FFFFFF" w:sz="0"/>
+              <w:left w:val="none" w:color="FFFFFF" w:sz="0"/>
+              <w:bottom w:val="none" w:color="FFFFFF" w:sz="0"/>
+              <w:right w:val="none" w:color="FFFFFF" w:sz="0"/>
+            </w:tcBorders>
+            <w:tcMar>
+              <w:top w:type="dxa" w:w="0"/>
+              <w:left w:type="dxa" w:w="0"/>
+              <w:bottom w:type="dxa" w:w="0"/>
+              <w:right w:type="dxa" w:w="0"/>
+            </w:tcMar>
+          </w:tcPr>
+          <w:p>
+            <w:pPr>
+              <w:spacing w:after="0" w:before="0" w:line="20" w:lineRule="exact"/>
+            </w:pPr>
+            <w:r>
+              <w:rPr>
+                <w:sz w:val="2"/>
+                <w:szCs w:val="2"/>
+              </w:rPr>
+              <w:t xml:space="preserve"/>
             </w:r>
           </w:p>
         </w:tc>
@@ -468,6 +711,35 @@
         </w:tc>
         <w:tc>
           <w:tcPr>
+            <w:tcW w:type="dxa" w:w="113"/>
+            <w:tcBorders>
+              <w:top w:val="none" w:color="FFFFFF" w:sz="0"/>
+              <w:left w:val="none" w:color="FFFFFF" w:sz="0"/>
+              <w:bottom w:val="none" w:color="FFFFFF" w:sz="0"/>
+              <w:right w:val="none" w:color="FFFFFF" w:sz="0"/>
+            </w:tcBorders>
+            <w:tcMar>
+              <w:top w:type="dxa" w:w="0"/>
+              <w:left w:type="dxa" w:w="0"/>
+              <w:bottom w:type="dxa" w:w="0"/>
+              <w:right w:type="dxa" w:w="0"/>
+            </w:tcMar>
+          </w:tcPr>
+          <w:p>
+            <w:pPr>
+              <w:spacing w:after="0" w:before="0" w:line="20" w:lineRule="exact"/>
+            </w:pPr>
+            <w:r>
+              <w:rPr>
+                <w:sz w:val="2"/>
+                <w:szCs w:val="2"/>
+              </w:rPr>
+              <w:t xml:space="preserve"/>
+            </w:r>
+          </w:p>
+        </w:tc>
+        <w:tc>
+          <w:tcPr>
             <w:tcW w:type="dxa" w:w="5102"/>
             <w:tcBorders>
               <w:top w:val="single" w:color="9E9E9E" w:sz="4"/>
@@ -549,6 +821,98 @@
                 <w:szCs w:val="32"/>
               </w:rPr>
               <w:t xml:space="preserve">- Wearable Device -</w:t>
+            </w:r>
+          </w:p>
+        </w:tc>
+      </w:tr>
+      <w:tr>
+        <w:trPr>
+          <w:trHeight w:val="113" w:hRule="exact"/>
+        </w:trPr>
+        <w:tc>
+          <w:tcPr>
+            <w:tcW w:type="dxa" w:w="5102"/>
+            <w:tcBorders>
+              <w:top w:val="none" w:color="FFFFFF" w:sz="0"/>
+              <w:left w:val="none" w:color="FFFFFF" w:sz="0"/>
+              <w:bottom w:val="none" w:color="FFFFFF" w:sz="0"/>
+              <w:right w:val="none" w:color="FFFFFF" w:sz="0"/>
+            </w:tcBorders>
+            <w:tcMar>
+              <w:top w:type="dxa" w:w="0"/>
+              <w:left w:type="dxa" w:w="0"/>
+              <w:bottom w:type="dxa" w:w="0"/>
+              <w:right w:type="dxa" w:w="0"/>
+            </w:tcMar>
+          </w:tcPr>
+          <w:p>
+            <w:pPr>
+              <w:spacing w:after="0" w:before="0" w:line="20" w:lineRule="exact"/>
+            </w:pPr>
+            <w:r>
+              <w:rPr>
+                <w:sz w:val="2"/>
+                <w:szCs w:val="2"/>
+              </w:rPr>
+              <w:t xml:space="preserve"/>
+            </w:r>
+          </w:p>
+        </w:tc>
+        <w:tc>
+          <w:tcPr>
+            <w:tcW w:type="dxa" w:w="113"/>
+            <w:tcBorders>
+              <w:top w:val="none" w:color="FFFFFF" w:sz="0"/>
+              <w:left w:val="none" w:color="FFFFFF" w:sz="0"/>
+              <w:bottom w:val="none" w:color="FFFFFF" w:sz="0"/>
+              <w:right w:val="none" w:color="FFFFFF" w:sz="0"/>
+            </w:tcBorders>
+            <w:tcMar>
+              <w:top w:type="dxa" w:w="0"/>
+              <w:left w:type="dxa" w:w="0"/>
+              <w:bottom w:type="dxa" w:w="0"/>
+              <w:right w:type="dxa" w:w="0"/>
+            </w:tcMar>
+          </w:tcPr>
+          <w:p>
+            <w:pPr>
+              <w:spacing w:after="0" w:before="0" w:line="20" w:lineRule="exact"/>
+            </w:pPr>
+            <w:r>
+              <w:rPr>
+                <w:sz w:val="2"/>
+                <w:szCs w:val="2"/>
+              </w:rPr>
+              <w:t xml:space="preserve"/>
+            </w:r>
+          </w:p>
+        </w:tc>
+        <w:tc>
+          <w:tcPr>
+            <w:tcW w:type="dxa" w:w="5102"/>
+            <w:tcBorders>
+              <w:top w:val="none" w:color="FFFFFF" w:sz="0"/>
+              <w:left w:val="none" w:color="FFFFFF" w:sz="0"/>
+              <w:bottom w:val="none" w:color="FFFFFF" w:sz="0"/>
+              <w:right w:val="none" w:color="FFFFFF" w:sz="0"/>
+            </w:tcBorders>
+            <w:tcMar>
+              <w:top w:type="dxa" w:w="0"/>
+              <w:left w:type="dxa" w:w="0"/>
+              <w:bottom w:type="dxa" w:w="0"/>
+              <w:right w:type="dxa" w:w="0"/>
+            </w:tcMar>
+          </w:tcPr>
+          <w:p>
+            <w:pPr>
+              <w:spacing w:after="0" w:before="0" w:line="20" w:lineRule="exact"/>
+            </w:pPr>
+            <w:r>
+              <w:rPr>
+                <w:sz w:val="2"/>
+                <w:szCs w:val="2"/>
+              </w:rPr>
+              <w:t xml:space="preserve"/>
             </w:r>
           </w:p>
         </w:tc>
@@ -646,6 +1010,35 @@
         </w:tc>
         <w:tc>
           <w:tcPr>
+            <w:tcW w:type="dxa" w:w="113"/>
+            <w:tcBorders>
+              <w:top w:val="none" w:color="FFFFFF" w:sz="0"/>
+              <w:left w:val="none" w:color="FFFFFF" w:sz="0"/>
+              <w:bottom w:val="none" w:color="FFFFFF" w:sz="0"/>
+              <w:right w:val="none" w:color="FFFFFF" w:sz="0"/>
+            </w:tcBorders>
+            <w:tcMar>
+              <w:top w:type="dxa" w:w="0"/>
+              <w:left w:type="dxa" w:w="0"/>
+              <w:bottom w:type="dxa" w:w="0"/>
+              <w:right w:type="dxa" w:w="0"/>
+            </w:tcMar>
+          </w:tcPr>
+          <w:p>
+            <w:pPr>
+              <w:spacing w:after="0" w:before="0" w:line="20" w:lineRule="exact"/>
+            </w:pPr>
+            <w:r>
+              <w:rPr>
+                <w:sz w:val="2"/>
+                <w:szCs w:val="2"/>
+              </w:rPr>
+              <w:t xml:space="preserve"/>
+            </w:r>
+          </w:p>
+        </w:tc>
+        <w:tc>
+          <w:tcPr>
             <w:tcW w:type="dxa" w:w="5102"/>
             <w:tcBorders>
               <w:top w:val="single" w:color="9E9E9E" w:sz="4"/>
@@ -727,6 +1120,98 @@
                 <w:szCs w:val="32"/>
               </w:rPr>
               <w:t xml:space="preserve">- Wearable Device -</w:t>
+            </w:r>
+          </w:p>
+        </w:tc>
+      </w:tr>
+      <w:tr>
+        <w:trPr>
+          <w:trHeight w:val="113" w:hRule="exact"/>
+        </w:trPr>
+        <w:tc>
+          <w:tcPr>
+            <w:tcW w:type="dxa" w:w="5102"/>
+            <w:tcBorders>
+              <w:top w:val="none" w:color="FFFFFF" w:sz="0"/>
+              <w:left w:val="none" w:color="FFFFFF" w:sz="0"/>
+              <w:bottom w:val="none" w:color="FFFFFF" w:sz="0"/>
+              <w:right w:val="none" w:color="FFFFFF" w:sz="0"/>
+            </w:tcBorders>
+            <w:tcMar>
+              <w:top w:type="dxa" w:w="0"/>
+              <w:left w:type="dxa" w:w="0"/>
+              <w:bottom w:type="dxa" w:w="0"/>
+              <w:right w:type="dxa" w:w="0"/>
+            </w:tcMar>
+          </w:tcPr>
+          <w:p>
+            <w:pPr>
+              <w:spacing w:after="0" w:before="0" w:line="20" w:lineRule="exact"/>
+            </w:pPr>
+            <w:r>
+              <w:rPr>
+                <w:sz w:val="2"/>
+                <w:szCs w:val="2"/>
+              </w:rPr>
+              <w:t xml:space="preserve"/>
+            </w:r>
+          </w:p>
+        </w:tc>
+        <w:tc>
+          <w:tcPr>
+            <w:tcW w:type="dxa" w:w="113"/>
+            <w:tcBorders>
+              <w:top w:val="none" w:color="FFFFFF" w:sz="0"/>
+              <w:left w:val="none" w:color="FFFFFF" w:sz="0"/>
+              <w:bottom w:val="none" w:color="FFFFFF" w:sz="0"/>
+              <w:right w:val="none" w:color="FFFFFF" w:sz="0"/>
+            </w:tcBorders>
+            <w:tcMar>
+              <w:top w:type="dxa" w:w="0"/>
+              <w:left w:type="dxa" w:w="0"/>
+              <w:bottom w:type="dxa" w:w="0"/>
+              <w:right w:type="dxa" w:w="0"/>
+            </w:tcMar>
+          </w:tcPr>
+          <w:p>
+            <w:pPr>
+              <w:spacing w:after="0" w:before="0" w:line="20" w:lineRule="exact"/>
+            </w:pPr>
+            <w:r>
+              <w:rPr>
+                <w:sz w:val="2"/>
+                <w:szCs w:val="2"/>
+              </w:rPr>
+              <w:t xml:space="preserve"/>
+            </w:r>
+          </w:p>
+        </w:tc>
+        <w:tc>
+          <w:tcPr>
+            <w:tcW w:type="dxa" w:w="5102"/>
+            <w:tcBorders>
+              <w:top w:val="none" w:color="FFFFFF" w:sz="0"/>
+              <w:left w:val="none" w:color="FFFFFF" w:sz="0"/>
+              <w:bottom w:val="none" w:color="FFFFFF" w:sz="0"/>
+              <w:right w:val="none" w:color="FFFFFF" w:sz="0"/>
+            </w:tcBorders>
+            <w:tcMar>
+              <w:top w:type="dxa" w:w="0"/>
+              <w:left w:type="dxa" w:w="0"/>
+              <w:bottom w:type="dxa" w:w="0"/>
+              <w:right w:type="dxa" w:w="0"/>
+            </w:tcMar>
+          </w:tcPr>
+          <w:p>
+            <w:pPr>
+              <w:spacing w:after="0" w:before="0" w:line="20" w:lineRule="exact"/>
+            </w:pPr>
+            <w:r>
+              <w:rPr>
+                <w:sz w:val="2"/>
+                <w:szCs w:val="2"/>
+              </w:rPr>
+              <w:t xml:space="preserve"/>
             </w:r>
           </w:p>
         </w:tc>
@@ -819,6 +1304,35 @@
                 <w:szCs w:val="32"/>
               </w:rPr>
               <w:t xml:space="preserve">- Kiosk-type Device -</w:t>
+            </w:r>
+          </w:p>
+        </w:tc>
+        <w:tc>
+          <w:tcPr>
+            <w:tcW w:type="dxa" w:w="113"/>
+            <w:tcBorders>
+              <w:top w:val="none" w:color="FFFFFF" w:sz="0"/>
+              <w:left w:val="none" w:color="FFFFFF" w:sz="0"/>
+              <w:bottom w:val="none" w:color="FFFFFF" w:sz="0"/>
+              <w:right w:val="none" w:color="FFFFFF" w:sz="0"/>
+            </w:tcBorders>
+            <w:tcMar>
+              <w:top w:type="dxa" w:w="0"/>
+              <w:left w:type="dxa" w:w="0"/>
+              <w:bottom w:type="dxa" w:w="0"/>
+              <w:right w:type="dxa" w:w="0"/>
+            </w:tcMar>
+          </w:tcPr>
+          <w:p>
+            <w:pPr>
+              <w:spacing w:after="0" w:before="0" w:line="20" w:lineRule="exact"/>
+            </w:pPr>
+            <w:r>
+              <w:rPr>
+                <w:sz w:val="2"/>
+                <w:szCs w:val="2"/>
+              </w:rPr>
+              <w:t xml:space="preserve"/>
             </w:r>
           </w:p>
         </w:tc>
@@ -924,7 +1438,7 @@
     </w:p>
     <w:sectPr>
       <w:pgSz w:w="11906" w:h="16838" w:orient="portrait"/>
-      <w:pgMar w:top="624" w:right="850" w:bottom="510" w:left="850" w:header="0" w:footer="0" w:gutter="0"/>
+      <w:pgMar w:top="397" w:right="794" w:bottom="340" w:left="794" w:header="0" w:footer="0" w:gutter="0"/>
       <w:pgNumType/>
       <w:docGrid w:linePitch="360"/>
     </w:sectPr>

</xml_diff>